<commit_message>
Add app screenshots and UCI data dictionary
</commit_message>
<xml_diff>
--- a/documentation/technical_documentation.docx
+++ b/documentation/technical_documentation.docx
@@ -188,7 +188,7 @@
         <w:br/>
         <w:t>tests/                         Automated tests (pytest)</w:t>
         <w:br/>
-        <w:t>documentation/                 Pre-registration, data dictionary, this document, figures</w:t>
+        <w:t>documentation/                 Pre-registration, data dictionary, this document, figures, screenshots</w:t>
         <w:br/>
         <w:t>paper/                         IMRaD paper (DOCX and PDF)</w:t>
       </w:r>
@@ -1677,6 +1677,224 @@
       </w:tr>
     </w:tbl>
     <w:p/>
+    <w:p>
+      <w:pPr>
+        <w:pStyle w:val="Heading1"/>
+      </w:pPr>
+      <w:r>
+        <w:t>10. Screenshots</w:t>
+      </w:r>
+    </w:p>
+    <w:p>
+      <w:r>
+        <w:t>All screenshots are in documentation/screenshots/. They were taken from the app running locally with the five sample patients in Appendix B of the paper.</w:t>
+      </w:r>
+    </w:p>
+    <w:p>
+      <w:r>
+        <w:drawing>
+          <wp:inline xmlns:a="http://schemas.openxmlformats.org/drawingml/2006/main" xmlns:pic="http://schemas.openxmlformats.org/drawingml/2006/picture">
+            <wp:extent cx="3291840" cy="5596128"/>
+            <wp:docPr id="1" name="Picture 1"/>
+            <wp:cNvGraphicFramePr>
+              <a:graphicFrameLocks noChangeAspect="1"/>
+            </wp:cNvGraphicFramePr>
+            <a:graphic>
+              <a:graphicData uri="http://schemas.openxmlformats.org/drawingml/2006/picture">
+                <pic:pic>
+                  <pic:nvPicPr>
+                    <pic:cNvPr id="0" name="app_01_refer_result.png"/>
+                    <pic:cNvPicPr/>
+                  </pic:nvPicPr>
+                  <pic:blipFill>
+                    <a:blip r:embed="rId9"/>
+                    <a:stretch>
+                      <a:fillRect/>
+                    </a:stretch>
+                  </pic:blipFill>
+                  <pic:spPr>
+                    <a:xfrm>
+                      <a:off x="0" y="0"/>
+                      <a:ext cx="3291840" cy="5596128"/>
+                    </a:xfrm>
+                    <a:prstGeom prst="rect"/>
+                  </pic:spPr>
+                </pic:pic>
+              </a:graphicData>
+            </a:graphic>
+          </wp:inline>
+        </w:drawing>
+      </w:r>
+    </w:p>
+    <w:p>
+      <w:r>
+        <w:t>One patient: a valid input with a referral recommendation.</w:t>
+      </w:r>
+    </w:p>
+    <w:p>
+      <w:r>
+        <w:drawing>
+          <wp:inline xmlns:a="http://schemas.openxmlformats.org/drawingml/2006/main" xmlns:pic="http://schemas.openxmlformats.org/drawingml/2006/picture">
+            <wp:extent cx="3291840" cy="5596128"/>
+            <wp:docPr id="2" name="Picture 2"/>
+            <wp:cNvGraphicFramePr>
+              <a:graphicFrameLocks noChangeAspect="1"/>
+            </wp:cNvGraphicFramePr>
+            <a:graphic>
+              <a:graphicData uri="http://schemas.openxmlformats.org/drawingml/2006/picture">
+                <pic:pic>
+                  <pic:nvPicPr>
+                    <pic:cNvPr id="0" name="app_02_invalid_input.png"/>
+                    <pic:cNvPicPr/>
+                  </pic:nvPicPr>
+                  <pic:blipFill>
+                    <a:blip r:embed="rId10"/>
+                    <a:stretch>
+                      <a:fillRect/>
+                    </a:stretch>
+                  </pic:blipFill>
+                  <pic:spPr>
+                    <a:xfrm>
+                      <a:off x="0" y="0"/>
+                      <a:ext cx="3291840" cy="5596128"/>
+                    </a:xfrm>
+                    <a:prstGeom prst="rect"/>
+                  </pic:spPr>
+                </pic:pic>
+              </a:graphicData>
+            </a:graphic>
+          </wp:inline>
+        </w:drawing>
+      </w:r>
+    </w:p>
+    <w:p>
+      <w:r>
+        <w:t>One patient: an out-of-range age and a diastolic pressure above systolic are rejected with a message.</w:t>
+      </w:r>
+    </w:p>
+    <w:p>
+      <w:r>
+        <w:drawing>
+          <wp:inline xmlns:a="http://schemas.openxmlformats.org/drawingml/2006/main" xmlns:pic="http://schemas.openxmlformats.org/drawingml/2006/picture">
+            <wp:extent cx="3291840" cy="5596128"/>
+            <wp:docPr id="3" name="Picture 3"/>
+            <wp:cNvGraphicFramePr>
+              <a:graphicFrameLocks noChangeAspect="1"/>
+            </wp:cNvGraphicFramePr>
+            <a:graphic>
+              <a:graphicData uri="http://schemas.openxmlformats.org/drawingml/2006/picture">
+                <pic:pic>
+                  <pic:nvPicPr>
+                    <pic:cNvPr id="0" name="app_03_csv_upload.png"/>
+                    <pic:cNvPicPr/>
+                  </pic:nvPicPr>
+                  <pic:blipFill>
+                    <a:blip r:embed="rId11"/>
+                    <a:stretch>
+                      <a:fillRect/>
+                    </a:stretch>
+                  </pic:blipFill>
+                  <pic:spPr>
+                    <a:xfrm>
+                      <a:off x="0" y="0"/>
+                      <a:ext cx="3291840" cy="5596128"/>
+                    </a:xfrm>
+                    <a:prstGeom prst="rect"/>
+                  </pic:spPr>
+                </pic:pic>
+              </a:graphicData>
+            </a:graphic>
+          </wp:inline>
+        </w:drawing>
+      </w:r>
+    </w:p>
+    <w:p>
+      <w:r>
+        <w:t>Upload a CSV: row 5 is skipped with the reason, the other rows are screened. The About the model panel is open.</w:t>
+      </w:r>
+    </w:p>
+    <w:p>
+      <w:r>
+        <w:drawing>
+          <wp:inline xmlns:a="http://schemas.openxmlformats.org/drawingml/2006/main" xmlns:pic="http://schemas.openxmlformats.org/drawingml/2006/picture">
+            <wp:extent cx="5486400" cy="1659948"/>
+            <wp:docPr id="4" name="Picture 4"/>
+            <wp:cNvGraphicFramePr>
+              <a:graphicFrameLocks noChangeAspect="1"/>
+            </wp:cNvGraphicFramePr>
+            <a:graphic>
+              <a:graphicData uri="http://schemas.openxmlformats.org/drawingml/2006/picture">
+                <pic:pic>
+                  <pic:nvPicPr>
+                    <pic:cNvPr id="0" name="app_04_csv_results_columns.png"/>
+                    <pic:cNvPicPr/>
+                  </pic:nvPicPr>
+                  <pic:blipFill>
+                    <a:blip r:embed="rId12"/>
+                    <a:stretch>
+                      <a:fillRect/>
+                    </a:stretch>
+                  </pic:blipFill>
+                  <pic:spPr>
+                    <a:xfrm>
+                      <a:off x="0" y="0"/>
+                      <a:ext cx="5486400" cy="1659948"/>
+                    </a:xfrm>
+                    <a:prstGeom prst="rect"/>
+                  </pic:spPr>
+                </pic:pic>
+              </a:graphicData>
+            </a:graphic>
+          </wp:inline>
+        </w:drawing>
+      </w:r>
+    </w:p>
+    <w:p>
+      <w:r>
+        <w:t>Upload a CSV: the result columns of the same table.</w:t>
+      </w:r>
+    </w:p>
+    <w:p>
+      <w:r>
+        <w:drawing>
+          <wp:inline xmlns:a="http://schemas.openxmlformats.org/drawingml/2006/main" xmlns:pic="http://schemas.openxmlformats.org/drawingml/2006/picture">
+            <wp:extent cx="3291840" cy="5596128"/>
+            <wp:docPr id="5" name="Picture 5"/>
+            <wp:cNvGraphicFramePr>
+              <a:graphicFrameLocks noChangeAspect="1"/>
+            </wp:cNvGraphicFramePr>
+            <a:graphic>
+              <a:graphicData uri="http://schemas.openxmlformats.org/drawingml/2006/picture">
+                <pic:pic>
+                  <pic:nvPicPr>
+                    <pic:cNvPr id="0" name="app_05_inputs_and_units.png"/>
+                    <pic:cNvPicPr/>
+                  </pic:nvPicPr>
+                  <pic:blipFill>
+                    <a:blip r:embed="rId13"/>
+                    <a:stretch>
+                      <a:fillRect/>
+                    </a:stretch>
+                  </pic:blipFill>
+                  <pic:spPr>
+                    <a:xfrm>
+                      <a:off x="0" y="0"/>
+                      <a:ext cx="3291840" cy="5596128"/>
+                    </a:xfrm>
+                    <a:prstGeom prst="rect"/>
+                  </pic:spPr>
+                </pic:pic>
+              </a:graphicData>
+            </a:graphic>
+          </wp:inline>
+        </w:drawing>
+      </w:r>
+    </w:p>
+    <w:p>
+      <w:r>
+        <w:t>Inputs and units tab.</w:t>
+      </w:r>
+    </w:p>
     <w:sectPr>
       <w:pgSz w:w="12240" w:h="15840"/>
       <w:pgMar w:top="1440" w:right="1296" w:bottom="1440" w:left="1296" w:header="720" w:footer="720" w:gutter="0"/>

</xml_diff>

<commit_message>
Restyle the screening app and update screenshots
</commit_message>
<xml_diff>
--- a/documentation/technical_documentation.docx
+++ b/documentation/technical_documentation.docx
@@ -157,6 +157,8 @@
           <w:sz w:val="18"/>
         </w:rPr>
         <w:t>app/streamlit_app.py           Streamlit app</w:t>
+        <w:br/>
+        <w:t>.streamlit/config.toml         App theme (colors and font)</w:t>
         <w:br/>
         <w:t>data/original/nhanes/          10 original NHANES files (.xpt)</w:t>
         <w:br/>
@@ -1817,7 +1819,7 @@
       <w:r>
         <w:drawing>
           <wp:inline xmlns:a="http://schemas.openxmlformats.org/drawingml/2006/main" xmlns:pic="http://schemas.openxmlformats.org/drawingml/2006/picture">
-            <wp:extent cx="5486400" cy="1659948"/>
+            <wp:extent cx="5486400" cy="1659947"/>
             <wp:docPr id="4" name="Picture 4"/>
             <wp:cNvGraphicFramePr>
               <a:graphicFrameLocks noChangeAspect="1"/>
@@ -1838,7 +1840,7 @@
                   <pic:spPr>
                     <a:xfrm>
                       <a:off x="0" y="0"/>
-                      <a:ext cx="5486400" cy="1659948"/>
+                      <a:ext cx="5486400" cy="1659947"/>
                     </a:xfrm>
                     <a:prstGeom prst="rect"/>
                   </pic:spPr>

</xml_diff>

<commit_message>
Rename project to Pre-lab CKD Early Detection using Random Forest
</commit_message>
<xml_diff>
--- a/documentation/technical_documentation.docx
+++ b/documentation/technical_documentation.docx
@@ -7,7 +7,7 @@
         <w:pStyle w:val="Title"/>
       </w:pPr>
       <w:r>
-        <w:t>Technical documentation: Pre-lab CKD Risk Screening</w:t>
+        <w:t>Technical documentation: Pre-lab CKD Early Detection using Random Forest</w:t>
       </w:r>
     </w:p>
     <w:p>
@@ -1696,7 +1696,7 @@
       <w:r>
         <w:drawing>
           <wp:inline xmlns:a="http://schemas.openxmlformats.org/drawingml/2006/main" xmlns:pic="http://schemas.openxmlformats.org/drawingml/2006/picture">
-            <wp:extent cx="3291840" cy="5596128"/>
+            <wp:extent cx="3291840" cy="5813389"/>
             <wp:docPr id="1" name="Picture 1"/>
             <wp:cNvGraphicFramePr>
               <a:graphicFrameLocks noChangeAspect="1"/>
@@ -1717,7 +1717,7 @@
                   <pic:spPr>
                     <a:xfrm>
                       <a:off x="0" y="0"/>
-                      <a:ext cx="3291840" cy="5596128"/>
+                      <a:ext cx="3291840" cy="5813389"/>
                     </a:xfrm>
                     <a:prstGeom prst="rect"/>
                   </pic:spPr>
@@ -1737,7 +1737,7 @@
       <w:r>
         <w:drawing>
           <wp:inline xmlns:a="http://schemas.openxmlformats.org/drawingml/2006/main" xmlns:pic="http://schemas.openxmlformats.org/drawingml/2006/picture">
-            <wp:extent cx="3291840" cy="5596128"/>
+            <wp:extent cx="3291840" cy="5171480"/>
             <wp:docPr id="2" name="Picture 2"/>
             <wp:cNvGraphicFramePr>
               <a:graphicFrameLocks noChangeAspect="1"/>
@@ -1758,7 +1758,7 @@
                   <pic:spPr>
                     <a:xfrm>
                       <a:off x="0" y="0"/>
-                      <a:ext cx="3291840" cy="5596128"/>
+                      <a:ext cx="3291840" cy="5171480"/>
                     </a:xfrm>
                     <a:prstGeom prst="rect"/>
                   </pic:spPr>
@@ -1778,7 +1778,7 @@
       <w:r>
         <w:drawing>
           <wp:inline xmlns:a="http://schemas.openxmlformats.org/drawingml/2006/main" xmlns:pic="http://schemas.openxmlformats.org/drawingml/2006/picture">
-            <wp:extent cx="3291840" cy="5596128"/>
+            <wp:extent cx="3291840" cy="5171480"/>
             <wp:docPr id="3" name="Picture 3"/>
             <wp:cNvGraphicFramePr>
               <a:graphicFrameLocks noChangeAspect="1"/>
@@ -1799,7 +1799,7 @@
                   <pic:spPr>
                     <a:xfrm>
                       <a:off x="0" y="0"/>
-                      <a:ext cx="3291840" cy="5596128"/>
+                      <a:ext cx="3291840" cy="5171480"/>
                     </a:xfrm>
                     <a:prstGeom prst="rect"/>
                   </pic:spPr>
@@ -1860,7 +1860,7 @@
       <w:r>
         <w:drawing>
           <wp:inline xmlns:a="http://schemas.openxmlformats.org/drawingml/2006/main" xmlns:pic="http://schemas.openxmlformats.org/drawingml/2006/picture">
-            <wp:extent cx="3291840" cy="5596128"/>
+            <wp:extent cx="3291840" cy="4634910"/>
             <wp:docPr id="5" name="Picture 5"/>
             <wp:cNvGraphicFramePr>
               <a:graphicFrameLocks noChangeAspect="1"/>
@@ -1881,7 +1881,7 @@
                   <pic:spPr>
                     <a:xfrm>
                       <a:off x="0" y="0"/>
-                      <a:ext cx="3291840" cy="5596128"/>
+                      <a:ext cx="3291840" cy="4634910"/>
                     </a:xfrm>
                     <a:prstGeom prst="rect"/>
                   </pic:spPr>

</xml_diff>

<commit_message>
Add testing-capacity option, post-hoc results and kill criteria to app and paper
</commit_message>
<xml_diff>
--- a/documentation/technical_documentation.docx
+++ b/documentation/technical_documentation.docx
@@ -1205,16 +1205,7 @@
         <w:pStyle w:val="ListNumber"/>
       </w:pPr>
       <w:r>
-        <w:t xml:space="preserve">For many patients, use </w:t>
-      </w:r>
-      <w:r>
-        <w:rPr>
-          <w:b/>
-        </w:rPr>
-        <w:t>Upload a CSV</w:t>
-      </w:r>
-      <w:r>
-        <w:t>, then download the results.</w:t>
+        <w:t>For many patients, use Upload a CSV. If the clinic can only test some people, enter Tests available first: only that many patients are referred, highest scores first, and every row gets a Priority (1 = highest score). Then download the results.</w:t>
       </w:r>
     </w:p>
     <w:p>
@@ -1285,6 +1276,14 @@
       </w:pPr>
       <w:r>
         <w:t>NHANES survey weights were not used, so results describe the sample, not the US population.</w:t>
+      </w:r>
+    </w:p>
+    <w:p>
+      <w:pPr>
+        <w:pStyle w:val="ListBullet"/>
+      </w:pPr>
+      <w:r>
+        <w:t>On F2 the model is tied with a simple risk-factor rule (test difference 0.003, 95% CI -0.017 to 0.024). Its advantage is ranking when tests are limited, and that is a post-hoc finding (notebook 03, section 11).</w:t>
       </w:r>
     </w:p>
     <w:p>
@@ -1778,7 +1777,7 @@
       <w:r>
         <w:drawing>
           <wp:inline xmlns:a="http://schemas.openxmlformats.org/drawingml/2006/main" xmlns:pic="http://schemas.openxmlformats.org/drawingml/2006/picture">
-            <wp:extent cx="3291840" cy="5171480"/>
+            <wp:extent cx="3291840" cy="5573085"/>
             <wp:docPr id="3" name="Picture 3"/>
             <wp:cNvGraphicFramePr>
               <a:graphicFrameLocks noChangeAspect="1"/>
@@ -1799,7 +1798,7 @@
                   <pic:spPr>
                     <a:xfrm>
                       <a:off x="0" y="0"/>
-                      <a:ext cx="3291840" cy="5171480"/>
+                      <a:ext cx="3291840" cy="5573085"/>
                     </a:xfrm>
                     <a:prstGeom prst="rect"/>
                   </pic:spPr>
@@ -1812,7 +1811,7 @@
     </w:p>
     <w:p>
       <w:r>
-        <w:t>Upload a CSV: row 5 is skipped with the reason, the other rows are screened. The About the model panel is open.</w:t>
+        <w:t>Upload a CSV with 2 tests available: the two highest scores are referred, row 5 is skipped with the reason. The About the model panel is open.</w:t>
       </w:r>
     </w:p>
     <w:p>
@@ -1853,7 +1852,7 @@
     </w:p>
     <w:p>
       <w:r>
-        <w:t>Upload a CSV: the result columns of the same table.</w:t>
+        <w:t>Upload a CSV: the result columns of the same table, including each row's priority.</w:t>
       </w:r>
     </w:p>
     <w:p>

</xml_diff>